<commit_message>
feat(release): phase 3 release audit, 2-page ATS resume pagination, prototype launch paths, and readiness verification
</commit_message>
<xml_diff>
--- a/docs/Asim_Kumar_PM_Resume.docx
+++ b/docs/Asim_Kumar_PM_Resume.docx
@@ -455,6 +455,11 @@
       </w:r>
     </w:p>
     <w:p>
+      <w:r>
+        <w:br w:type="page"/>
+      </w:r>
+    </w:p>
+    <w:p>
       <w:pPr>
         <w:keepNext/>
         <w:spacing w:before="160" w:after="40"/>
@@ -840,6 +845,87 @@
         <w:t>Govt. Polytechnic Ambala City (2010 – 2013)</w:t>
       </w:r>
     </w:p>
+    <w:p>
+      <w:pPr>
+        <w:keepNext/>
+        <w:spacing w:before="160" w:after="40"/>
+        <w:pBdr>
+          <w:bottom w:val="single" w:sz="6" w:space="2" w:color="0E7490"/>
+        </w:pBdr>
+      </w:pPr>
+      <w:r>
+        <w:rPr>
+          <w:rFonts w:ascii="Arial" w:hAnsi="Arial"/>
+          <w:b/>
+          <w:color w:val="0E7490"/>
+          <w:sz w:val="19"/>
+        </w:rPr>
+        <w:t>TECHNICAL STACK &amp; OPERATIONAL TOOLING</w:t>
+      </w:r>
+    </w:p>
+    <w:p>
+      <w:pPr>
+        <w:pStyle w:val="ListBullet"/>
+        <w:spacing w:before="20" w:after="20"/>
+      </w:pPr>
+      <w:r>
+        <w:rPr>
+          <w:rFonts w:ascii="Arial" w:hAnsi="Arial"/>
+          <w:b/>
+          <w:sz w:val="17"/>
+        </w:rPr>
+        <w:t xml:space="preserve">Telecom &amp; Diagnostic Systems: </w:t>
+      </w:r>
+      <w:r>
+        <w:rPr>
+          <w:rFonts w:ascii="Arial" w:hAnsi="Arial"/>
+          <w:sz w:val="17"/>
+        </w:rPr>
+        <w:t>Carrier-grade DWDM/SDH (Nokia SM1660 Matrix E), GPON Optical Line Terminals (OLT) &amp; ONTs, Nokia Wi-Fi beacons, RF signal generators &amp; power amplifiers, spectrum analyzers.</w:t>
+      </w:r>
+    </w:p>
+    <w:p>
+      <w:pPr>
+        <w:pStyle w:val="ListBullet"/>
+        <w:spacing w:before="20" w:after="20"/>
+      </w:pPr>
+      <w:r>
+        <w:rPr>
+          <w:rFonts w:ascii="Arial" w:hAnsi="Arial"/>
+          <w:b/>
+          <w:sz w:val="17"/>
+        </w:rPr>
+        <w:t xml:space="preserve">Development &amp; Product Analytics: </w:t>
+      </w:r>
+      <w:r>
+        <w:rPr>
+          <w:rFonts w:ascii="Arial" w:hAnsi="Arial"/>
+          <w:sz w:val="17"/>
+        </w:rPr>
+        <w:t>Python 3, Flask, SQLite, TypeScript, REST APIs, Git, Jira, Trello, Confluence, Microsoft Excel (Advanced financial &amp; cohort modeling).</w:t>
+      </w:r>
+    </w:p>
+    <w:p>
+      <w:pPr>
+        <w:pStyle w:val="ListBullet"/>
+        <w:spacing w:before="20" w:after="20"/>
+      </w:pPr>
+      <w:r>
+        <w:rPr>
+          <w:rFonts w:ascii="Arial" w:hAnsi="Arial"/>
+          <w:b/>
+          <w:sz w:val="17"/>
+        </w:rPr>
+        <w:t xml:space="preserve">Methodologies &amp; Quality Standards: </w:t>
+      </w:r>
+      <w:r>
+        <w:rPr>
+          <w:rFonts w:ascii="Arial" w:hAnsi="Arial"/>
+          <w:sz w:val="17"/>
+        </w:rPr>
+        <w:t>Root Cause Analysis (RCA), Failure Mode and Effects Analysis (FMEA), Gherkin BDD specs, MoSCoW / RICE prioritization, statistical power analysis, automated anti-hallucination evaluation suites.</w:t>
+      </w:r>
+    </w:p>
     <w:sectPr>
       <w:pgSz w:w="12240" w:h="15840"/>
       <w:pgMar w:top="720" w:right="792" w:bottom="720" w:left="792" w:header="720" w:footer="720" w:gutter="0"/>

</xml_diff>

<commit_message>
fix(evidence): correct Experiment Tracker claims, clarify ReviewFlow offline evaluation, and align resume deliverables
</commit_message>
<xml_diff>
--- a/docs/Asim_Kumar_PM_Resume.docx
+++ b/docs/Asim_Kumar_PM_Resume.docx
@@ -278,7 +278,7 @@
           <w:rFonts w:ascii="Arial" w:hAnsi="Arial"/>
           <w:sz w:val="17"/>
         </w:rPr>
-        <w:t>Scoped MVP with MoSCoW; developed and verified a 15-case regression suite and automated evaluator measuring rating consistency, superlative drift, and format compliance.</w:t>
+        <w:t>Scoped MVP with MoSCoW; developed an offline 15-case regression suite and deterministic evaluator measuring rating consistency and format compliance.</w:t>
       </w:r>
     </w:p>
     <w:p>
@@ -402,7 +402,7 @@
           <w:rFonts w:ascii="Arial" w:hAnsi="Arial"/>
           <w:sz w:val="17"/>
         </w:rPr>
-        <w:t>Verified functionality across an automated 17-category verification suite and 26 test functions covering database integrity and decision gating.</w:t>
+        <w:t>Structured a 17-category verification suite and authored 26 automated test functions covering database integrity and decision gating.</w:t>
       </w:r>
     </w:p>
     <w:p>

</xml_diff>

<commit_message>
fix(review-fixes): resolve resume discrepancies, repair external hyperlinks, and correct QA test reporting
</commit_message>
<xml_diff>
--- a/docs/Asim_Kumar_PM_Resume.docx
+++ b/docs/Asim_Kumar_PM_Resume.docx
@@ -43,10 +43,76 @@
           <w:color w:val="475569"/>
           <w:sz w:val="17"/>
         </w:rPr>
-        <w:t>Gurugram, Haryana, India  •  +91 98177 53425  •  asimkumar613@gmail.com</w:t>
+        <w:t xml:space="preserve">Gurugram, Haryana, India  •  +91 98177 53425  •  </w:t>
+      </w:r>
+      <w:hyperlink r:id="rId9" w:history="1">
+        <w:r>
+          <w:rPr>
+            <w:rFonts w:ascii="Arial" w:hAnsi="Arial"/>
+            <w:color w:val="0E7490"/>
+            <w:sz w:val="17"/>
+          </w:rPr>
+          <w:t xml:space="preserve">asimkumar613@gmail.com</w:t>
+        </w:r>
+      </w:hyperlink>
+      <w:r>
+        <w:rPr>
+          <w:rFonts w:ascii="Arial" w:hAnsi="Arial"/>
+          <w:color w:val="475569"/>
+          <w:sz w:val="17"/>
+        </w:rPr>
         <w:br/>
-        <w:t>Portfolio: github.com/asimk714/asim-portfolio  •  LinkedIn: linkedin.com/in/asim-kumar-b69558188  •  GitHub: github.com/asimk714</w:t>
+        <w:t xml:space="preserve">Portfolio: </w:t>
       </w:r>
+      <w:hyperlink r:id="rId10" w:history="1">
+        <w:r>
+          <w:rPr>
+            <w:rFonts w:ascii="Arial" w:hAnsi="Arial"/>
+            <w:color w:val="0E7490"/>
+            <w:u w:val="single"/>
+            <w:sz w:val="17"/>
+          </w:rPr>
+          <w:t xml:space="preserve">github.com/asimk714/asim-portfolio</w:t>
+        </w:r>
+      </w:hyperlink>
+      <w:r>
+        <w:rPr>
+          <w:rFonts w:ascii="Arial" w:hAnsi="Arial"/>
+          <w:color w:val="475569"/>
+          <w:sz w:val="17"/>
+        </w:rPr>
+        <w:t xml:space="preserve">  •  LinkedIn: </w:t>
+      </w:r>
+      <w:hyperlink r:id="rId11" w:history="1">
+        <w:r>
+          <w:rPr>
+            <w:rFonts w:ascii="Arial" w:hAnsi="Arial"/>
+            <w:color w:val="0E7490"/>
+            <w:u w:val="single"/>
+            <w:sz w:val="17"/>
+          </w:rPr>
+          <w:t xml:space="preserve">linkedin.com/in/asim-kumar-b69558188</w:t>
+        </w:r>
+      </w:hyperlink>
+      <w:r>
+        <w:rPr>
+          <w:rFonts w:ascii="Arial" w:hAnsi="Arial"/>
+          <w:color w:val="475569"/>
+          <w:sz w:val="17"/>
+        </w:rPr>
+        <w:t xml:space="preserve">  •  GitHub: </w:t>
+      </w:r>
+      <w:hyperlink r:id="rId12" w:history="1">
+        <w:r>
+          <w:rPr>
+            <w:rFonts w:ascii="Arial" w:hAnsi="Arial"/>
+            <w:color w:val="0E7490"/>
+            <w:u w:val="single"/>
+            <w:sz w:val="17"/>
+          </w:rPr>
+          <w:t xml:space="preserve">github.com/asimk714</w:t>
+        </w:r>
+      </w:hyperlink>
     </w:p>
     <w:p>
       <w:pPr>

</xml_diff>

<commit_message>
fix(portfolio): correct factual discrepancies across resume, templates, and docs (Phase 5.3)
- Align ReviewFlow product purpose to customer review drafting assistant
- Harmonize Experiment Tracker candidate count to 8 evaluated capabilities
- Remove stale '10 HTML tests included in the 22' reference in experiment-tracker.html
- Reconcile IRCTC claims to match actual prototype and teardown scope
- Transparently label Unrot 6-role cross-functional decision brief as simulated exercise
- Rebuild PDF, DOCX, and TXT resume artifacts with verified binary attributes
</commit_message>
<xml_diff>
--- a/docs/Asim_Kumar_PM_Resume.docx
+++ b/docs/Asim_Kumar_PM_Resume.docx
@@ -296,7 +296,7 @@
           <w:b/>
           <w:sz w:val="18"/>
         </w:rPr>
-        <w:t>ReviewFlow — AI-Assisted Customer Review Analysis &amp; Response Pipeline</w:t>
+        <w:t>ReviewFlow — AI-Assisted Customer Review Drafting &amp; Quality Evaluation</w:t>
       </w:r>
       <w:r>
         <w:rPr>
@@ -318,7 +318,7 @@
           <w:rFonts w:ascii="Arial" w:hAnsi="Arial"/>
           <w:sz w:val="17"/>
         </w:rPr>
-        <w:t>Defined product boundaries for an AI review synthesis tool designed to draft context-faithful salon responses while preventing hallucinated claims.</w:t>
+        <w:t>Defined product boundaries for an AI review drafting tool helping salon customers articulate authentic Google reviews while preventing hallucinated claims.</w:t>
       </w:r>
     </w:p>
     <w:p>
@@ -367,7 +367,7 @@
           <w:color w:val="475569"/>
           <w:sz w:val="16"/>
         </w:rPr>
-        <w:t xml:space="preserve">  [Retention Modeling, Experiment Design &amp; Strategic Decision Brief]</w:t>
+        <w:t xml:space="preserve">  [Retention Modeling, Experiment Design &amp; Simulated Decision Brief]</w:t>
       </w:r>
     </w:p>
     <w:p>
@@ -406,7 +406,7 @@
           <w:rFonts w:ascii="Arial" w:hAnsi="Arial"/>
           <w:sz w:val="17"/>
         </w:rPr>
-        <w:t>Authored a comprehensive 6-role cross-functional decision brief (Product, Business, UX, Data, Eng, QA) establishing clear pre-test verification guardrails.</w:t>
+        <w:t>Authored a simulated 6-role cross-functional decision brief (Product, Business, UX, Data, Eng, QA) demonstrating trade-off alignment as a portfolio exercise.</w:t>
       </w:r>
     </w:p>
     <w:p>
@@ -455,7 +455,7 @@
           <w:rFonts w:ascii="Arial" w:hAnsi="Arial"/>
           <w:sz w:val="17"/>
         </w:rPr>
-        <w:t>Authored a 7-candidate product brief; prioritized conclusion capture (closing the loop in ~27 lines) over non-essential charting and complex auth.</w:t>
+        <w:t>Authored an 8-candidate product brief; prioritized conclusion capture (closing the loop in ~27 lines) over non-essential charting and complex auth.</w:t>
       </w:r>
     </w:p>
     <w:p>
@@ -517,7 +517,7 @@
           <w:rFonts w:ascii="Arial" w:hAnsi="Arial"/>
           <w:sz w:val="17"/>
         </w:rPr>
-        <w:t>IRCTC Rail Connect: Mapped the 120-second Tatkal booking funnel; isolated 4 core friction points and built a 2-step checkout prototype with pre-saved passenger vaults and 1-tap UPI.</w:t>
+        <w:t>IRCTC Rail Connect: Analyzed high-concurrency booking failure modes (latency, layout shifts, timeouts) across an illustrative funnel; built an interactive prototype with passenger autofill and queue handling.</w:t>
       </w:r>
     </w:p>
     <w:p>

</xml_diff>